<commit_message>
Before trip to Toronto, September 2026
</commit_message>
<xml_diff>
--- a/paper/population_title_page.docx
+++ b/paper/population_title_page.docx
@@ -1,113 +1,265 @@
 
 <file path=word/document.xml><?xml version="1.0" encoding="utf-8"?>
-<w:document xmlns:wpc="http://schemas.microsoft.com/office/word/2010/wordprocessingCanvas" xmlns:cx="http://schemas.microsoft.com/office/drawing/2014/chartex" xmlns:cx1="http://schemas.microsoft.com/office/drawing/2015/9/8/chartex" xmlns:cx2="http://schemas.microsoft.com/office/drawing/2015/10/21/chartex" xmlns:cx3="http://schemas.microsoft.com/office/drawing/2016/5/9/chartex" xmlns:cx4="http://schemas.microsoft.com/office/drawing/2016/5/10/chartex" xmlns:cx5="http://schemas.microsoft.com/office/drawing/2016/5/11/chartex" xmlns:cx6="http://schemas.microsoft.com/office/drawing/2016/5/12/chartex" xmlns:cx7="http://schemas.microsoft.com/office/drawing/2016/5/13/chartex" xmlns:cx8="http://schemas.microsoft.com/office/drawing/2016/5/14/chartex" xmlns:mc="http://schemas.openxmlformats.org/markup-compatibility/2006" xmlns:aink="http://schemas.microsoft.com/office/drawing/2016/ink" xmlns:am3d="http://schemas.microsoft.com/office/drawing/2017/model3d" xmlns:o="urn:schemas-microsoft-com:office:office" xmlns:oel="http://schemas.microsoft.com/office/2019/extlst" xmlns:r="http://schemas.openxmlformats.org/officeDocument/2006/relationships" xmlns:m="http://schemas.openxmlformats.org/officeDocument/2006/math" xmlns:v="urn:schemas-microsoft-com:vml" xmlns:wp14="http://schemas.microsoft.com/office/word/2010/wordprocessingDrawing" xmlns:wp="http://schemas.openxmlformats.org/drawingml/2006/wordprocessingDrawing" xmlns:w10="urn:schemas-microsoft-com:office:word" xmlns:w="http://schemas.openxmlformats.org/wordprocessingml/2006/main" xmlns:w14="http://schemas.microsoft.com/office/word/2010/wordml" xmlns:w15="http://schemas.microsoft.com/office/word/2012/wordml" xmlns:w16cex="http://schemas.microsoft.com/office/word/2018/wordml/cex" xmlns:w16cid="http://schemas.microsoft.com/office/word/2016/wordml/cid" xmlns:w16="http://schemas.microsoft.com/office/word/2018/wordml" xmlns:w16du="http://schemas.microsoft.com/office/word/2023/wordml/word16du" xmlns:w16sdtdh="http://schemas.microsoft.com/office/word/2020/wordml/sdtdatahash" xmlns:w16sdtfl="http://schemas.microsoft.com/office/word/2024/wordml/sdtformatlock" xmlns:w16se="http://schemas.microsoft.com/office/word/2015/wordml/symex" xmlns:wpg="http://schemas.microsoft.com/office/word/2010/wordprocessingGroup" xmlns:wpi="http://schemas.microsoft.com/office/word/2010/wordprocessingInk" xmlns:wne="http://schemas.microsoft.com/office/word/2006/wordml" xmlns:wps="http://schemas.microsoft.com/office/word/2010/wordprocessingShape" mc:Ignorable="w14 w15 w16se w16cid w16 w16cex w16sdtdh w16sdtfl w16du wp14">
+<w:document xmlns:wpc="http://schemas.microsoft.com/office/word/2010/wordprocessingCanvas" xmlns:cx="http://schemas.microsoft.com/office/drawing/2014/chartex" xmlns:cx1="http://schemas.microsoft.com/office/drawing/2015/9/8/chartex" xmlns:cx2="http://schemas.microsoft.com/office/drawing/2015/10/21/chartex" xmlns:cx3="http://schemas.microsoft.com/office/drawing/2016/5/9/chartex" xmlns:cx4="http://schemas.microsoft.com/office/drawing/2016/5/10/chartex" xmlns:cx5="http://schemas.microsoft.com/office/drawing/2016/5/11/chartex" xmlns:cx6="http://schemas.microsoft.com/office/drawing/2016/5/12/chartex" xmlns:cx7="http://schemas.microsoft.com/office/drawing/2016/5/13/chartex" xmlns:cx8="http://schemas.microsoft.com/office/drawing/2016/5/14/chartex" xmlns:mc="http://schemas.openxmlformats.org/markup-compatibility/2006" xmlns:m="http://schemas.openxmlformats.org/officeDocument/2006/math" xmlns:aink="http://schemas.microsoft.com/office/drawing/2016/ink" xmlns:am3d="http://schemas.microsoft.com/office/drawing/2017/model3d" xmlns:oel="http://schemas.microsoft.com/office/2019/extlst" xmlns:r="http://schemas.openxmlformats.org/officeDocument/2006/relationships" xmlns:wp14="http://schemas.microsoft.com/office/word/2010/wordprocessingDrawing" xmlns:wp="http://schemas.openxmlformats.org/drawingml/2006/wordprocessingDrawing" xmlns:wpg="http://schemas.microsoft.com/office/word/2010/wordprocessingGroup" xmlns:wpi="http://schemas.microsoft.com/office/word/2010/wordprocessingInk" xmlns:wps="http://schemas.microsoft.com/office/word/2010/wordprocessingShape" xmlns:o="urn:schemas-microsoft-com:office:office" xmlns:v="urn:schemas-microsoft-com:vml" xmlns:w10="urn:schemas-microsoft-com:office:word" xmlns:w="http://schemas.openxmlformats.org/wordprocessingml/2006/main" xmlns:w14="http://schemas.microsoft.com/office/word/2010/wordml" xmlns:w15="http://schemas.microsoft.com/office/word/2012/wordml" xmlns:w16cex="http://schemas.microsoft.com/office/word/2018/wordml/cex" xmlns:w16cid="http://schemas.microsoft.com/office/word/2016/wordml/cid" xmlns:w16="http://schemas.microsoft.com/office/word/2018/wordml" xmlns:w16sdtdh="http://schemas.microsoft.com/office/word/2020/wordml/sdtdatahash" xmlns:w16sdtfl="http://schemas.microsoft.com/office/word/2024/wordml/sdtformatlock" xmlns:w16se="http://schemas.microsoft.com/office/word/2015/wordml/symex" xmlns:w16du="http://schemas.microsoft.com/office/word/2023/wordml/word16du" xmlns:wne="http://schemas.microsoft.com/office/word/2006/wordml" mc:Ignorable="w14 w15 w16se w16cid w16 w16cex w16sdtdh w16sdtfl w16du wp14">
   <w:body>
     <w:p>
-      <w:r>
-        <w:t>A population choice experiment for testing axioms of stochastic discrete choice</w:t>
-      </w:r>
-    </w:p>
-    <w:p>
-      <w:r>
-        <w:t>William J. McCausland</w:t>
-      </w:r>
+      <w:pPr>
+        <w:keepNext/>
+        <w:spacing w:after="240"/>
+        <w:jc w:val="center"/>
+      </w:pPr>
       <w:r>
         <w:rPr>
-          <w:vertAlign w:val="superscript"/>
+          <w:b/>
+          <w:sz w:val="32"/>
         </w:rPr>
-        <w:t>*1</w:t>
-      </w:r>
-      <w:r>
-        <w:t>, A.A.J. Marley</w:t>
-      </w:r>
-      <w:r>
-        <w:rPr>
-          <w:vertAlign w:val="superscript"/>
-        </w:rPr>
-        <w:t>2</w:t>
-      </w:r>
-      <w:r>
-        <w:t xml:space="preserve"> and Clintin P. Davis-Stober</w:t>
-      </w:r>
-      <w:r>
-        <w:rPr>
-          <w:vertAlign w:val="superscript"/>
-        </w:rPr>
-        <w:t>†3</w:t>
+        <w:t>A choice experiment for testing stochastic discrete choice conditions</w:t>
       </w:r>
     </w:p>
     <w:p>
       <w:pPr>
+        <w:keepNext/>
+        <w:spacing w:after="160"/>
+        <w:jc w:val="center"/>
+      </w:pPr>
+      <w:r>
+        <w:rPr>
+          <w:sz w:val="24"/>
+        </w:rPr>
+        <w:t>William J. McCausland¹, A.A.J. Marley² and Clintin P. Davis-Stober³</w:t>
+      </w:r>
+    </w:p>
+    <w:p>
+      <w:pPr>
+        <w:spacing w:after="40"/>
+        <w:jc w:val="center"/>
+        <w:rPr>
+          <w:lang w:val="fr-CA"/>
+        </w:rPr>
+      </w:pPr>
+      <w:proofErr w:type="gramStart"/>
+      <w:r>
+        <w:rPr>
+          <w:sz w:val="21"/>
+          <w:lang w:val="fr-CA"/>
+        </w:rPr>
+        <w:t>¹</w:t>
+      </w:r>
+      <w:proofErr w:type="gramEnd"/>
+      <w:r>
+        <w:rPr>
+          <w:sz w:val="21"/>
+          <w:lang w:val="fr-CA"/>
+        </w:rPr>
+        <w:t xml:space="preserve"> Département de sciences économiques and CIREQ, Université de Montréal, Canada</w:t>
+      </w:r>
+    </w:p>
+    <w:p>
+      <w:pPr>
+        <w:spacing w:after="40"/>
+        <w:jc w:val="center"/>
+      </w:pPr>
+      <w:r>
+        <w:rPr>
+          <w:sz w:val="21"/>
+        </w:rPr>
+        <w:t>² Department of Psychology, University of Victoria, Canada</w:t>
+      </w:r>
+    </w:p>
+    <w:p>
+      <w:pPr>
+        <w:spacing w:after="160"/>
+        <w:jc w:val="center"/>
+      </w:pPr>
+      <w:r>
+        <w:rPr>
+          <w:sz w:val="21"/>
+        </w:rPr>
+        <w:t>³ Department of Psychological Sciences; MU Institute for Data Science and Informatics, University of Missouri, U.S.A.</w:t>
+      </w:r>
+    </w:p>
+    <w:p>
+      <w:pPr>
+        <w:spacing w:after="240"/>
+        <w:jc w:val="center"/>
+      </w:pPr>
+      <w:r>
+        <w:t>August 21, 2026</w:t>
+      </w:r>
+    </w:p>
+    <w:p>
+      <w:pPr>
+        <w:keepNext/>
+        <w:spacing w:after="80"/>
+        <w:jc w:val="center"/>
+      </w:pPr>
+      <w:r>
+        <w:rPr>
+          <w:b/>
+        </w:rPr>
+        <w:t>Abstract</w:t>
+      </w:r>
+    </w:p>
+    <w:p>
+      <w:pPr>
+        <w:spacing w:after="140"/>
+        <w:jc w:val="both"/>
+      </w:pPr>
+      <w:r>
+        <w:rPr>
+          <w:sz w:val="21"/>
+        </w:rPr>
+        <w:t>We run an experiment covering 32 different choice domains, including fine art, cars and pizza. For each domain, there is a set of five related items, and 26 menus—the subsets of two or more items. We measure population-level choice probabilities by presenting, within each domain, each of its 26 menus to a distinct group of at least 40 participants (1042 participants in total) and observing each participant’s choice of one option. Each participant faces exactly one menu per domain. The purpose of the experiment is to allow tests of various conditions over choice probabilities, over a wide variety of choice domains. It is particularly well suited for testing conditions, like regularity, the random utility condition and the multiplicative inequality, which constrain choice probabilities across all menus of a domain. For each domain and each of the three conditions above, we report Bayes factors giving evidence for or against the condition. Regularity and random utility, conditions that most discrete choice models satisfy, survive this battery of tests: across the 32 domains, Bayes factors generally support them and nowhere is there more than slight evidence against them. In contrast, very strong evidence against the multiplicative inequality in three domains shows that it cannot be considered as a universal condition on population-level choice. Classes of models implying it—including the classes of independent random utility models and Elimination by Aspects models—are not universally adequate for modelling population-level choice.</w:t>
+      </w:r>
+    </w:p>
+    <w:p>
+      <w:pPr>
+        <w:spacing w:after="80"/>
+      </w:pPr>
+      <w:r>
+        <w:rPr>
+          <w:b/>
+          <w:sz w:val="21"/>
+        </w:rPr>
+        <w:t>Key words:</w:t>
+      </w:r>
+      <w:r>
+        <w:rPr>
+          <w:sz w:val="21"/>
+        </w:rPr>
+        <w:t xml:space="preserve"> Discrete choice, Stochastic choice, Choice experiment, Context effects, Random utility, Bayesian inference</w:t>
+      </w:r>
+    </w:p>
+    <w:p>
+      <w:pPr>
+        <w:spacing w:after="200"/>
         <w:rPr>
           <w:lang w:val="fr-CA"/>
         </w:rPr>
       </w:pPr>
       <w:r>
         <w:rPr>
+          <w:b/>
+          <w:sz w:val="21"/>
           <w:lang w:val="fr-CA"/>
         </w:rPr>
-        <w:t>1 Département de sciences économiques and CIREQ, Université de Montréal, Canada</w:t>
+        <w:t>JEL codes:</w:t>
       </w:r>
-    </w:p>
-    <w:p>
       <w:r>
-        <w:t>2 Department of Psychology, University of Victoria, Canada</w:t>
-      </w:r>
-    </w:p>
-    <w:p>
-      <w:r>
-        <w:t>3 Department of Psychological Sciences; MU Institute for Data Science and Informatics, University of Missouri, U.S.A.</w:t>
-      </w:r>
-    </w:p>
-    <w:p>
-      <w:r>
-        <w:t>May 23, 2025</w:t>
+        <w:rPr>
+          <w:sz w:val="21"/>
+          <w:lang w:val="fr-CA"/>
+        </w:rPr>
+        <w:t xml:space="preserve"> C11, C12, C15, C35, C91, D01, D90.</w:t>
       </w:r>
     </w:p>
     <w:p>
       <w:pPr>
-        <w:pStyle w:val="Heading2"/>
+        <w:keepNext/>
+        <w:spacing w:after="80"/>
+        <w:jc w:val="center"/>
       </w:pPr>
       <w:r>
-        <w:t>Abstract</w:t>
-      </w:r>
-    </w:p>
-    <w:p>
-      <w:r>
-        <w:t>We conducted an experiment suitable for testing axioms of stochastic discrete choice, including regularity, random utility and various forms of stochastic transitivity, for population level choice probabilities. Participants are representative of the Canadian adult population. The experiment features 32 different choice domains, including fine art, travel itineraries, and pizza toppings. For each domain, there is a set of five related objects, and for each of its 26 doubleton and larger subsets, we observe the choices of 40 participants. This allows us to measure population probabilities with some precision; since we do this for all non-degenerate menus of a given domain, we expose every implication of each of the axioms to possible falsification. Each participant faces exactly one menu from each domain, making this a strictly between-subject design; unlike similar studies with within-subject or mixed designs, the standard assumption that choices are independent, and on each menu, identically distributed, is innocuous. For each domain, we report Bayes factors giving evidence for or against each of the axioms.</w:t>
-      </w:r>
-    </w:p>
-    <w:p>
-      <w:r>
-        <w:t>Key words: Discrete choice, Choice axioms, Choice experiment, Context effects, Random utility, Bayesian inference</w:t>
+        <w:rPr>
+          <w:b/>
+        </w:rPr>
+        <w:t>Author Note</w:t>
       </w:r>
     </w:p>
     <w:p>
       <w:pPr>
-        <w:rPr>
-          <w:lang w:val="fr-CA"/>
-        </w:rPr>
+        <w:spacing w:after="80"/>
       </w:pPr>
       <w:r>
         <w:rPr>
-          <w:lang w:val="fr-CA"/>
+          <w:b/>
+          <w:sz w:val="20"/>
         </w:rPr>
-        <w:t>JEL codes: C11, C12, C15, C35, C91, D01, D90.</w:t>
+        <w:t>Corresponding author:</w:t>
+      </w:r>
+      <w:r>
+        <w:rPr>
+          <w:sz w:val="20"/>
+        </w:rPr>
+        <w:t xml:space="preserve"> William J. McCausland, william.j.mccausland@umontreal.ca; ORCID: 0000-0002-9896-235X.</w:t>
       </w:r>
     </w:p>
     <w:p>
+      <w:pPr>
+        <w:spacing w:after="80"/>
+      </w:pPr>
       <w:r>
-        <w:t>* Corresponding author, william.j.mccausland@umontreal.ca, ORCID: 0000-0002-9896-235X. Data and code are publicly available at the Github repository https://github.com/mccauslw/Population.</w:t>
+        <w:rPr>
+          <w:sz w:val="20"/>
+        </w:rPr>
+        <w:t>Clintin P. Davis-Stober ORCID: 0000-0002-6836-6979.</w:t>
       </w:r>
     </w:p>
     <w:p>
+      <w:pPr>
+        <w:spacing w:after="80"/>
+      </w:pPr>
       <w:r>
-        <w:t>† ORCID: 0000-0002-6836-6979</w:t>
+        <w:rPr>
+          <w:sz w:val="20"/>
+        </w:rPr>
+        <w:t>This work was supported by the Social Sciences and Humanities Research Council of Canada under Insight grant SSHRC 435-2012-0451 to the University of Victoria for Marley and McCausland.</w:t>
+      </w:r>
+    </w:p>
+    <w:p>
+      <w:pPr>
+        <w:spacing w:after="80"/>
+      </w:pPr>
+      <w:r>
+        <w:rPr>
+          <w:sz w:val="20"/>
+        </w:rPr>
+        <w:t>The authors are grateful to the Institute for Choice at the University of South Australia for programming and hosting the survey; Survey Sampling International for recruiting participants; the participants themselves; audiences at various conferences for insightful questions and helpful suggestions; and referees for helpful comments and suggestions.</w:t>
+      </w:r>
+      <w:r>
+        <w:rPr>
+          <w:sz w:val="20"/>
+        </w:rPr>
+        <w:t xml:space="preserve"> We used ChatGPT for copyediting.</w:t>
+      </w:r>
+    </w:p>
+    <w:p>
+      <w:pPr>
+        <w:spacing w:after="0"/>
+      </w:pPr>
+      <w:r>
+        <w:rPr>
+          <w:b/>
+          <w:sz w:val="20"/>
+        </w:rPr>
+        <w:t xml:space="preserve">Supplementary materials: </w:t>
+      </w:r>
+      <w:r>
+        <w:rPr>
+          <w:sz w:val="20"/>
+        </w:rPr>
+        <w:t xml:space="preserve">Data, code and documents related to the experiment are publicly available at </w:t>
+      </w:r>
+      <w:hyperlink r:id="rId6">
+        <w:r>
+          <w:rPr>
+            <w:color w:val="0563C1"/>
+            <w:sz w:val="20"/>
+            <w:u w:val="single"/>
+          </w:rPr>
+          <w:t>https://github.com/mccauslw/Population</w:t>
+        </w:r>
+      </w:hyperlink>
+      <w:r>
+        <w:rPr>
+          <w:sz w:val="20"/>
+        </w:rPr>
+        <w:t>.</w:t>
       </w:r>
     </w:p>
     <w:sectPr>
       <w:pgSz w:w="12240" w:h="15840"/>
-      <w:pgMar w:top="1440" w:right="1800" w:bottom="1440" w:left="1800" w:header="720" w:footer="720" w:gutter="0"/>
+      <w:pgMar w:top="1152" w:right="1440" w:bottom="1152" w:left="1440" w:header="432" w:footer="432" w:gutter="0"/>
       <w:cols w:space="720"/>
       <w:docGrid w:linePitch="360"/>
     </w:sectPr>
@@ -116,7 +268,7 @@
 </file>
 
 <file path=word/numbering.xml><?xml version="1.0" encoding="utf-8"?>
-<w:numbering xmlns:wpc="http://schemas.microsoft.com/office/word/2010/wordprocessingCanvas" xmlns:cx="http://schemas.microsoft.com/office/drawing/2014/chartex" xmlns:cx1="http://schemas.microsoft.com/office/drawing/2015/9/8/chartex" xmlns:cx2="http://schemas.microsoft.com/office/drawing/2015/10/21/chartex" xmlns:cx3="http://schemas.microsoft.com/office/drawing/2016/5/9/chartex" xmlns:cx4="http://schemas.microsoft.com/office/drawing/2016/5/10/chartex" xmlns:cx5="http://schemas.microsoft.com/office/drawing/2016/5/11/chartex" xmlns:cx6="http://schemas.microsoft.com/office/drawing/2016/5/12/chartex" xmlns:cx7="http://schemas.microsoft.com/office/drawing/2016/5/13/chartex" xmlns:cx8="http://schemas.microsoft.com/office/drawing/2016/5/14/chartex" xmlns:mc="http://schemas.openxmlformats.org/markup-compatibility/2006" xmlns:aink="http://schemas.microsoft.com/office/drawing/2016/ink" xmlns:am3d="http://schemas.microsoft.com/office/drawing/2017/model3d" xmlns:o="urn:schemas-microsoft-com:office:office" xmlns:oel="http://schemas.microsoft.com/office/2019/extlst" xmlns:r="http://schemas.openxmlformats.org/officeDocument/2006/relationships" xmlns:m="http://schemas.openxmlformats.org/officeDocument/2006/math" xmlns:v="urn:schemas-microsoft-com:vml" xmlns:wp14="http://schemas.microsoft.com/office/word/2010/wordprocessingDrawing" xmlns:wp="http://schemas.openxmlformats.org/drawingml/2006/wordprocessingDrawing" xmlns:w10="urn:schemas-microsoft-com:office:word" xmlns:w="http://schemas.openxmlformats.org/wordprocessingml/2006/main" xmlns:w14="http://schemas.microsoft.com/office/word/2010/wordml" xmlns:w15="http://schemas.microsoft.com/office/word/2012/wordml" xmlns:w16cex="http://schemas.microsoft.com/office/word/2018/wordml/cex" xmlns:w16cid="http://schemas.microsoft.com/office/word/2016/wordml/cid" xmlns:w16="http://schemas.microsoft.com/office/word/2018/wordml" xmlns:w16du="http://schemas.microsoft.com/office/word/2023/wordml/word16du" xmlns:w16sdtdh="http://schemas.microsoft.com/office/word/2020/wordml/sdtdatahash" xmlns:w16sdtfl="http://schemas.microsoft.com/office/word/2024/wordml/sdtformatlock" xmlns:w16se="http://schemas.microsoft.com/office/word/2015/wordml/symex" xmlns:wpg="http://schemas.microsoft.com/office/word/2010/wordprocessingGroup" xmlns:wpi="http://schemas.microsoft.com/office/word/2010/wordprocessingInk" xmlns:wne="http://schemas.microsoft.com/office/word/2006/wordml" xmlns:wps="http://schemas.microsoft.com/office/word/2010/wordprocessingShape" mc:Ignorable="w14 w15 w16se w16cid w16 w16cex w16sdtdh w16sdtfl w16du wp14">
+<w:numbering xmlns:wpc="http://schemas.microsoft.com/office/word/2010/wordprocessingCanvas" xmlns:cx="http://schemas.microsoft.com/office/drawing/2014/chartex" xmlns:cx1="http://schemas.microsoft.com/office/drawing/2015/9/8/chartex" xmlns:cx2="http://schemas.microsoft.com/office/drawing/2015/10/21/chartex" xmlns:cx3="http://schemas.microsoft.com/office/drawing/2016/5/9/chartex" xmlns:cx4="http://schemas.microsoft.com/office/drawing/2016/5/10/chartex" xmlns:cx5="http://schemas.microsoft.com/office/drawing/2016/5/11/chartex" xmlns:cx6="http://schemas.microsoft.com/office/drawing/2016/5/12/chartex" xmlns:cx7="http://schemas.microsoft.com/office/drawing/2016/5/13/chartex" xmlns:cx8="http://schemas.microsoft.com/office/drawing/2016/5/14/chartex" xmlns:mc="http://schemas.openxmlformats.org/markup-compatibility/2006" xmlns:m="http://schemas.openxmlformats.org/officeDocument/2006/math" xmlns:aink="http://schemas.microsoft.com/office/drawing/2016/ink" xmlns:am3d="http://schemas.microsoft.com/office/drawing/2017/model3d" xmlns:oel="http://schemas.microsoft.com/office/2019/extlst" xmlns:r="http://schemas.openxmlformats.org/officeDocument/2006/relationships" xmlns:wp14="http://schemas.microsoft.com/office/word/2010/wordprocessingDrawing" xmlns:wp="http://schemas.openxmlformats.org/drawingml/2006/wordprocessingDrawing" xmlns:wpg="http://schemas.microsoft.com/office/word/2010/wordprocessingGroup" xmlns:wpi="http://schemas.microsoft.com/office/word/2010/wordprocessingInk" xmlns:wps="http://schemas.microsoft.com/office/word/2010/wordprocessingShape" xmlns:o="urn:schemas-microsoft-com:office:office" xmlns:v="urn:schemas-microsoft-com:vml" xmlns:w10="urn:schemas-microsoft-com:office:word" xmlns:w="http://schemas.openxmlformats.org/wordprocessingml/2006/main" xmlns:w14="http://schemas.microsoft.com/office/word/2010/wordml" xmlns:w15="http://schemas.microsoft.com/office/word/2012/wordml" xmlns:w16cex="http://schemas.microsoft.com/office/word/2018/wordml/cex" xmlns:w16cid="http://schemas.microsoft.com/office/word/2016/wordml/cid" xmlns:w16="http://schemas.microsoft.com/office/word/2018/wordml" xmlns:w16sdtdh="http://schemas.microsoft.com/office/word/2020/wordml/sdtdatahash" xmlns:w16sdtfl="http://schemas.microsoft.com/office/word/2024/wordml/sdtformatlock" xmlns:w16se="http://schemas.microsoft.com/office/word/2015/wordml/symex" xmlns:w16du="http://schemas.microsoft.com/office/word/2023/wordml/word16du" xmlns:wne="http://schemas.microsoft.com/office/word/2006/wordml" mc:Ignorable="w14 w15 w16se w16cid w16 w16cex w16sdtdh w16sdtfl w16du wp14">
   <w:abstractNum w:abstractNumId="0" w15:restartNumberingAfterBreak="0">
     <w:nsid w:val="FFFFFF7C"/>
     <w:multiLevelType w:val="singleLevel"/>
@@ -288,38 +440,38 @@
       </w:rPr>
     </w:lvl>
   </w:abstractNum>
-  <w:num w:numId="1" w16cid:durableId="895581294">
+  <w:num w:numId="1" w16cid:durableId="650408525">
     <w:abstractNumId w:val="8"/>
   </w:num>
-  <w:num w:numId="2" w16cid:durableId="1750618044">
+  <w:num w:numId="2" w16cid:durableId="1521577814">
     <w:abstractNumId w:val="6"/>
   </w:num>
-  <w:num w:numId="3" w16cid:durableId="1427002155">
+  <w:num w:numId="3" w16cid:durableId="1484153732">
     <w:abstractNumId w:val="5"/>
   </w:num>
-  <w:num w:numId="4" w16cid:durableId="193545799">
+  <w:num w:numId="4" w16cid:durableId="1967344294">
     <w:abstractNumId w:val="4"/>
   </w:num>
-  <w:num w:numId="5" w16cid:durableId="135876852">
+  <w:num w:numId="5" w16cid:durableId="405497416">
     <w:abstractNumId w:val="7"/>
   </w:num>
-  <w:num w:numId="6" w16cid:durableId="179855882">
+  <w:num w:numId="6" w16cid:durableId="1597329568">
     <w:abstractNumId w:val="3"/>
   </w:num>
-  <w:num w:numId="7" w16cid:durableId="11035974">
+  <w:num w:numId="7" w16cid:durableId="1689209605">
     <w:abstractNumId w:val="2"/>
   </w:num>
-  <w:num w:numId="8" w16cid:durableId="1159350891">
+  <w:num w:numId="8" w16cid:durableId="1812823383">
     <w:abstractNumId w:val="1"/>
   </w:num>
-  <w:num w:numId="9" w16cid:durableId="1800295222">
+  <w:num w:numId="9" w16cid:durableId="552615581">
     <w:abstractNumId w:val="0"/>
   </w:num>
 </w:numbering>
 </file>
 
 <file path=word/styles.xml><?xml version="1.0" encoding="utf-8"?>
-<w:styles xmlns:mc="http://schemas.openxmlformats.org/markup-compatibility/2006" xmlns:r="http://schemas.openxmlformats.org/officeDocument/2006/relationships" xmlns:w="http://schemas.openxmlformats.org/wordprocessingml/2006/main" xmlns:w14="http://schemas.microsoft.com/office/word/2010/wordml" xmlns:w15="http://schemas.microsoft.com/office/word/2012/wordml" xmlns:w16cex="http://schemas.microsoft.com/office/word/2018/wordml/cex" xmlns:w16cid="http://schemas.microsoft.com/office/word/2016/wordml/cid" xmlns:w16="http://schemas.microsoft.com/office/word/2018/wordml" xmlns:w16du="http://schemas.microsoft.com/office/word/2023/wordml/word16du" xmlns:w16sdtdh="http://schemas.microsoft.com/office/word/2020/wordml/sdtdatahash" xmlns:w16sdtfl="http://schemas.microsoft.com/office/word/2024/wordml/sdtformatlock" xmlns:w16se="http://schemas.microsoft.com/office/word/2015/wordml/symex" mc:Ignorable="w14 w15 w16se w16cid w16 w16cex w16sdtdh w16sdtfl w16du">
+<w:styles xmlns:mc="http://schemas.openxmlformats.org/markup-compatibility/2006" xmlns:r="http://schemas.openxmlformats.org/officeDocument/2006/relationships" xmlns:w="http://schemas.openxmlformats.org/wordprocessingml/2006/main" xmlns:w14="http://schemas.microsoft.com/office/word/2010/wordml" xmlns:w15="http://schemas.microsoft.com/office/word/2012/wordml" xmlns:w16cex="http://schemas.microsoft.com/office/word/2018/wordml/cex" xmlns:w16cid="http://schemas.microsoft.com/office/word/2016/wordml/cid" xmlns:w16="http://schemas.microsoft.com/office/word/2018/wordml" xmlns:w16sdtdh="http://schemas.microsoft.com/office/word/2020/wordml/sdtdatahash" xmlns:w16sdtfl="http://schemas.microsoft.com/office/word/2024/wordml/sdtformatlock" xmlns:w16se="http://schemas.microsoft.com/office/word/2015/wordml/symex" xmlns:w16du="http://schemas.microsoft.com/office/word/2023/wordml/word16du" mc:Ignorable="w14 w15 w16se w16cid w16 w16cex w16sdtdh w16sdtfl w16du">
   <w:docDefaults>
     <w:rPrDefault>
       <w:rPr>
@@ -708,6 +860,12 @@
     <w:name w:val="Normal"/>
     <w:qFormat/>
     <w:rsid w:val="00FC693F"/>
+    <w:pPr>
+      <w:spacing w:after="120" w:line="240" w:lineRule="auto"/>
+    </w:pPr>
+    <w:rPr>
+      <w:rFonts w:ascii="Times New Roman" w:hAnsi="Times New Roman"/>
+    </w:rPr>
   </w:style>
   <w:style w:type="paragraph" w:styleId="Heading1">
     <w:name w:val="heading 1"/>
@@ -957,7 +1115,7 @@
         <w:tab w:val="center" w:pos="4680"/>
         <w:tab w:val="right" w:pos="9360"/>
       </w:tabs>
-      <w:spacing w:after="0" w:line="240" w:lineRule="auto"/>
+      <w:spacing w:after="0"/>
     </w:pPr>
   </w:style>
   <w:style w:type="character" w:customStyle="1" w:styleId="HeaderChar">
@@ -979,7 +1137,7 @@
         <w:tab w:val="center" w:pos="4680"/>
         <w:tab w:val="right" w:pos="9360"/>
       </w:tabs>
-      <w:spacing w:after="0" w:line="240" w:lineRule="auto"/>
+      <w:spacing w:after="0"/>
     </w:pPr>
   </w:style>
   <w:style w:type="character" w:customStyle="1" w:styleId="FooterChar">
@@ -1053,7 +1211,7 @@
       <w:pBdr>
         <w:bottom w:val="single" w:sz="8" w:space="4" w:color="4F81BD" w:themeColor="accent1"/>
       </w:pBdr>
-      <w:spacing w:after="300" w:line="240" w:lineRule="auto"/>
+      <w:spacing w:after="300"/>
       <w:contextualSpacing/>
     </w:pPr>
     <w:rPr>
@@ -1137,9 +1295,6 @@
     <w:uiPriority w:val="99"/>
     <w:unhideWhenUsed/>
     <w:rsid w:val="00AA1D8D"/>
-    <w:pPr>
-      <w:spacing w:after="120"/>
-    </w:pPr>
   </w:style>
   <w:style w:type="character" w:customStyle="1" w:styleId="BodyTextChar">
     <w:name w:val="Body Text Char"/>
@@ -1156,7 +1311,7 @@
     <w:unhideWhenUsed/>
     <w:rsid w:val="00AA1D8D"/>
     <w:pPr>
-      <w:spacing w:after="120" w:line="480" w:lineRule="auto"/>
+      <w:spacing w:line="480" w:lineRule="auto"/>
     </w:pPr>
   </w:style>
   <w:style w:type="character" w:customStyle="1" w:styleId="BodyText2Char">
@@ -1173,9 +1328,6 @@
     <w:uiPriority w:val="99"/>
     <w:unhideWhenUsed/>
     <w:rsid w:val="00AA1D8D"/>
-    <w:pPr>
-      <w:spacing w:after="120"/>
-    </w:pPr>
     <w:rPr>
       <w:sz w:val="16"/>
       <w:szCs w:val="16"/>
@@ -1310,7 +1462,6 @@
     <w:unhideWhenUsed/>
     <w:rsid w:val="0029639D"/>
     <w:pPr>
-      <w:spacing w:after="120"/>
       <w:ind w:left="360"/>
       <w:contextualSpacing/>
     </w:pPr>
@@ -1322,7 +1473,6 @@
     <w:unhideWhenUsed/>
     <w:rsid w:val="0029639D"/>
     <w:pPr>
-      <w:spacing w:after="120"/>
       <w:ind w:left="720"/>
       <w:contextualSpacing/>
     </w:pPr>
@@ -1334,7 +1484,6 @@
     <w:unhideWhenUsed/>
     <w:rsid w:val="0029639D"/>
     <w:pPr>
-      <w:spacing w:after="120"/>
       <w:ind w:left="1080"/>
       <w:contextualSpacing/>
     </w:pPr>
@@ -1495,9 +1644,6 @@
     <w:unhideWhenUsed/>
     <w:qFormat/>
     <w:rsid w:val="00FC693F"/>
-    <w:pPr>
-      <w:spacing w:line="240" w:lineRule="auto"/>
-    </w:pPr>
     <w:rPr>
       <w:b/>
       <w:bCs/>

</xml_diff>